<commit_message>
Remove list of sources from essay
Co-Authored-By: Claude Opus 5.5 <noreply@anthropic.com>
Claude-Session: https://claude.ai/code/session_012thMDTWJ8kDAZMCJYG1pE3
</commit_message>
<xml_diff>
--- a/referat/Реферат_Культурология_Жумартов.docx
+++ b/referat/Реферат_Культурология_Жумартов.docx
@@ -696,20 +696,6 @@
       </w:r>
     </w:p>
     <w:p>
-      <w:pPr>
-        <w:tabs>
-          <w:tab w:pos="9354" w:val="right" w:leader="dot"/>
-        </w:tabs>
-        <w:spacing w:after="0" w:before="0" w:line="276" w:lineRule="auto"/>
-        <w:ind w:firstLine="0"/>
-      </w:pPr>
-      <w:r>
-        <w:t>СПИСОК ИСПОЛЬЗОВАННЫХ ИСТОЧНИКОВ</w:t>
-        <w:tab/>
-        <w:t>24</w:t>
-      </w:r>
-    </w:p>
-    <w:p>
       <w:r>
         <w:br w:type="page"/>
       </w:r>
@@ -854,7 +840,7 @@
         <w:rPr>
           <w:b w:val="0"/>
         </w:rPr>
-        <w:t>Структура работы соответствует последовательности лекций: реферат состоит из введения, четырёх глав, заключения и списка использованных источников.</w:t>
+        <w:t>Структура работы соответствует последовательности лекций: реферат состоит из введения, четырёх глав и заключения.</w:t>
       </w:r>
     </w:p>
     <w:p>
@@ -2375,167 +2361,6 @@
           <w:b w:val="0"/>
         </w:rPr>
         <w:t>Таким образом, изучение культурологии помогает человеку осознанно воспринимать окружающий мир, понимать собственную культурную идентичность, уважать другие культуры и быть ответственным участником культурного процесса.</w:t>
-      </w:r>
-    </w:p>
-    <w:p>
-      <w:r>
-        <w:br w:type="page"/>
-      </w:r>
-    </w:p>
-    <w:p>
-      <w:pPr>
-        <w:spacing w:after="240" w:before="0"/>
-        <w:ind w:firstLine="0"/>
-        <w:jc w:val="center"/>
-      </w:pPr>
-      <w:r>
-        <w:rPr>
-          <w:b/>
-        </w:rPr>
-        <w:t>СПИСОК ИСПОЛЬЗОВАННЫХ ИСТОЧНИКОВ</w:t>
-      </w:r>
-    </w:p>
-    <w:p>
-      <w:pPr>
-        <w:spacing w:after="0" w:before="0"/>
-        <w:ind w:firstLine="709"/>
-        <w:jc w:val="both"/>
-      </w:pPr>
-      <w:r>
-        <w:rPr>
-          <w:b w:val="0"/>
-        </w:rPr>
-        <w:t>1. Исимбаев Е. Т. Лекция 1: Морфология культуры [Презентация]. — Астана: Казахский университет технологии и бизнеса, 2026.</w:t>
-      </w:r>
-    </w:p>
-    <w:p>
-      <w:pPr>
-        <w:spacing w:after="0" w:before="0"/>
-        <w:ind w:firstLine="709"/>
-        <w:jc w:val="both"/>
-      </w:pPr>
-      <w:r>
-        <w:rPr>
-          <w:b w:val="0"/>
-        </w:rPr>
-        <w:t>2. Исимбаев Е. Т. Лекция 2: Язык культуры [Презентация]. — Астана: Казахский университет технологии и бизнеса, 2026.</w:t>
-      </w:r>
-    </w:p>
-    <w:p>
-      <w:pPr>
-        <w:spacing w:after="0" w:before="0"/>
-        <w:ind w:firstLine="709"/>
-        <w:jc w:val="both"/>
-      </w:pPr>
-      <w:r>
-        <w:rPr>
-          <w:b w:val="0"/>
-        </w:rPr>
-        <w:t>3. Исимбаев Е. Т. Лекция 3: Семиотика культуры [Презентация]. — Астана: Казахский университет технологии и бизнеса, 2026.</w:t>
-      </w:r>
-    </w:p>
-    <w:p>
-      <w:pPr>
-        <w:spacing w:after="0" w:before="0"/>
-        <w:ind w:firstLine="709"/>
-        <w:jc w:val="both"/>
-      </w:pPr>
-      <w:r>
-        <w:rPr>
-          <w:b w:val="0"/>
-        </w:rPr>
-        <w:t>4. Исимбаев Е. Т. Лекция 4: Основные формы культуры [Презентация]. — Астана: Казахский университет технологии и бизнеса, 2026.</w:t>
-      </w:r>
-    </w:p>
-    <w:p>
-      <w:pPr>
-        <w:spacing w:after="0" w:before="0"/>
-        <w:ind w:firstLine="709"/>
-        <w:jc w:val="both"/>
-      </w:pPr>
-      <w:r>
-        <w:rPr>
-          <w:b w:val="0"/>
-        </w:rPr>
-        <w:t>5. Барт Р. Мифологии. — М.: Академический проект, 2010.</w:t>
-      </w:r>
-    </w:p>
-    <w:p>
-      <w:pPr>
-        <w:spacing w:after="0" w:before="0"/>
-        <w:ind w:firstLine="709"/>
-        <w:jc w:val="both"/>
-      </w:pPr>
-      <w:r>
-        <w:rPr>
-          <w:b w:val="0"/>
-        </w:rPr>
-        <w:t>6. Кассирер Э. Опыт о человеке: Введение в философию человеческой культуры // Проблема человека в западной философии. — М.: Прогресс, 1988.</w:t>
-      </w:r>
-    </w:p>
-    <w:p>
-      <w:pPr>
-        <w:spacing w:after="0" w:before="0"/>
-        <w:ind w:firstLine="709"/>
-        <w:jc w:val="both"/>
-      </w:pPr>
-      <w:r>
-        <w:rPr>
-          <w:b w:val="0"/>
-        </w:rPr>
-        <w:t>7. Кристева Ю. Избранные труды: Разрушение поэтики. — М.: РОССПЭН, 2004.</w:t>
-      </w:r>
-    </w:p>
-    <w:p>
-      <w:pPr>
-        <w:spacing w:after="0" w:before="0"/>
-        <w:ind w:firstLine="709"/>
-        <w:jc w:val="both"/>
-      </w:pPr>
-      <w:r>
-        <w:rPr>
-          <w:b w:val="0"/>
-        </w:rPr>
-        <w:t>8. Лотман Ю. М. Семиосфера. — СПб.: Искусство-СПБ, 2000.</w:t>
-      </w:r>
-    </w:p>
-    <w:p>
-      <w:pPr>
-        <w:spacing w:after="0" w:before="0"/>
-        <w:ind w:firstLine="709"/>
-        <w:jc w:val="both"/>
-      </w:pPr>
-      <w:r>
-        <w:rPr>
-          <w:b w:val="0"/>
-        </w:rPr>
-        <w:t>9. Соссюр Ф. де. Курс общей лингвистики. — М.: Едиториал УРСС, 2004.</w:t>
-      </w:r>
-    </w:p>
-    <w:p>
-      <w:pPr>
-        <w:spacing w:after="0" w:before="0"/>
-        <w:ind w:firstLine="709"/>
-        <w:jc w:val="both"/>
-      </w:pPr>
-      <w:r>
-        <w:rPr>
-          <w:b w:val="0"/>
-        </w:rPr>
-        <w:t>10. Сулейменов О. О. Аз и Я. Книга благонамеренного читателя. — Алма-Ата: Жазушы, 1975.</w:t>
-      </w:r>
-    </w:p>
-    <w:p>
-      <w:pPr>
-        <w:spacing w:after="0" w:before="0"/>
-        <w:ind w:firstLine="709"/>
-        <w:jc w:val="both"/>
-      </w:pPr>
-      <w:r>
-        <w:rPr>
-          <w:b w:val="0"/>
-        </w:rPr>
-        <w:t>11. Юнг К. Г. Архетип и символ. — М.: Ренессанс, 1991.</w:t>
       </w:r>
     </w:p>
     <w:sectPr>

</xml_diff>

<commit_message>
Remove ministry header from title page
Co-Authored-By: Claude Haiku 5.5 <noreply@anthropic.com>
Claude-Session: https://claude.ai/code/session_012thMDTWJ8kDAZMCJYG1pE3
</commit_message>
<xml_diff>
--- a/referat/Реферат_Культурология_Жумартов.docx
+++ b/referat/Реферат_Культурология_Жумартов.docx
@@ -2,32 +2,6 @@
 <file path=word/document.xml><?xml version="1.0" encoding="utf-8"?>
 <w:document xmlns:wpc="http://schemas.microsoft.com/office/word/2010/wordprocessingCanvas" xmlns:mo="http://schemas.microsoft.com/office/mac/office/2008/main" xmlns:mc="http://schemas.openxmlformats.org/markup-compatibility/2006" xmlns:mv="urn:schemas-microsoft-com:mac:vml" xmlns:o="urn:schemas-microsoft-com:office:office" xmlns:r="http://schemas.openxmlformats.org/officeDocument/2006/relationships" xmlns:m="http://schemas.openxmlformats.org/officeDocument/2006/math" xmlns:v="urn:schemas-microsoft-com:vml" xmlns:wp14="http://schemas.microsoft.com/office/word/2010/wordprocessingDrawing" xmlns:wp="http://schemas.openxmlformats.org/drawingml/2006/wordprocessingDrawing" xmlns:w10="urn:schemas-microsoft-com:office:word" xmlns:w="http://schemas.openxmlformats.org/wordprocessingml/2006/main" xmlns:w14="http://schemas.microsoft.com/office/word/2010/wordml" xmlns:wpg="http://schemas.microsoft.com/office/word/2010/wordprocessingGroup" xmlns:wpi="http://schemas.microsoft.com/office/word/2010/wordprocessingInk" xmlns:wne="http://schemas.microsoft.com/office/word/2006/wordml" xmlns:wps="http://schemas.microsoft.com/office/word/2010/wordprocessingShape" mc:Ignorable="w14 wp14">
   <w:body>
-    <w:p>
-      <w:pPr>
-        <w:spacing w:after="0" w:before="0" w:line="240" w:lineRule="auto"/>
-        <w:ind w:firstLine="0"/>
-        <w:jc w:val="center"/>
-      </w:pPr>
-      <w:r>
-        <w:rPr>
-          <w:b w:val="0"/>
-        </w:rPr>
-        <w:t>МИНИСТЕРСТВО НАУКИ И ВЫСШЕГО ОБРАЗОВАНИЯ</w:t>
-      </w:r>
-    </w:p>
-    <w:p>
-      <w:pPr>
-        <w:spacing w:after="120" w:before="0" w:line="240" w:lineRule="auto"/>
-        <w:ind w:firstLine="0"/>
-        <w:jc w:val="center"/>
-      </w:pPr>
-      <w:r>
-        <w:rPr>
-          <w:b w:val="0"/>
-        </w:rPr>
-        <w:t>РЕСПУБЛИКИ КАЗАХСТАН</w:t>
-      </w:r>
-    </w:p>
     <w:p>
       <w:pPr>
         <w:spacing w:after="0" w:before="0" w:line="240" w:lineRule="auto"/>
@@ -2759,7 +2733,7 @@
     </w:pPr>
     <w:rPr>
       <w:rFonts w:ascii="Times New Roman" w:hAnsi="Times New Roman" w:eastAsia="Times New Roman"/>
-      <w:sz w:val="28"/>
+      <w:sz w:val="24"/>
     </w:rPr>
   </w:style>
   <w:style w:type="paragraph" w:styleId="Header">

</xml_diff>

<commit_message>
Remove supervisor lines from title page
Co-Authored-By: Claude Haiku 5.5 <noreply@anthropic.com>
Claude-Session: https://claude.ai/code/session_012thMDTWJ8kDAZMCJYG1pE3
</commit_message>
<xml_diff>
--- a/referat/Реферат_Культурология_Жумартов.docx
+++ b/referat/Реферат_Культурология_Жумартов.docx
@@ -156,36 +156,6 @@
           <w:b w:val="0"/>
         </w:rPr>
         <w:t>Группа: ИС-262/2 СО</w:t>
-      </w:r>
-    </w:p>
-    <w:p>
-      <w:pPr>
-        <w:spacing w:after="0" w:before="0" w:line="276" w:lineRule="auto"/>
-        <w:ind w:firstLine="0" w:left="5102"/>
-      </w:pPr>
-    </w:p>
-    <w:p>
-      <w:pPr>
-        <w:spacing w:after="0" w:before="0" w:line="276" w:lineRule="auto"/>
-        <w:ind w:firstLine="0" w:left="5102"/>
-      </w:pPr>
-      <w:r>
-        <w:rPr>
-          <w:b w:val="0"/>
-        </w:rPr>
-        <w:t>Проверил: Исимбаев Е. Т.,</w:t>
-      </w:r>
-    </w:p>
-    <w:p>
-      <w:pPr>
-        <w:spacing w:after="0" w:before="0" w:line="276" w:lineRule="auto"/>
-        <w:ind w:firstLine="0" w:left="5102"/>
-      </w:pPr>
-      <w:r>
-        <w:rPr>
-          <w:b w:val="0"/>
-        </w:rPr>
-        <w:t>PhD, ассистент профессора</w:t>
       </w:r>
     </w:p>
     <w:p>

</xml_diff>

<commit_message>
Add short lecture summaries to essay
Co-Authored-By: Claude Haiku 5.5 <noreply@anthropic.com>
Claude-Session: https://claude.ai/code/session_012thMDTWJ8kDAZMCJYG1pE3
</commit_message>
<xml_diff>
--- a/referat/Реферат_Культурология_Жумартов.docx
+++ b/referat/Реферат_Культурология_Жумартов.docx
@@ -244,7 +244,7 @@
       <w:r>
         <w:t>ГЛАВА 1. МОРФОЛОГИЯ КУЛЬТУРЫ</w:t>
         <w:tab/>
-        <w:t>5</w:t>
+        <w:t>4</w:t>
       </w:r>
     </w:p>
     <w:p>
@@ -258,7 +258,7 @@
       <w:r>
         <w:t>1.1. Понятие морфологии культуры</w:t>
         <w:tab/>
-        <w:t>5</w:t>
+        <w:t>4</w:t>
       </w:r>
     </w:p>
     <w:p>
@@ -272,7 +272,7 @@
       <w:r>
         <w:t>1.2. Пространство и время культуры</w:t>
         <w:tab/>
-        <w:t>5</w:t>
+        <w:t>4</w:t>
       </w:r>
     </w:p>
     <w:p>
@@ -286,7 +286,7 @@
       <w:r>
         <w:t>1.3. Основные компоненты культуры</w:t>
         <w:tab/>
-        <w:t>6</w:t>
+        <w:t>5</w:t>
       </w:r>
     </w:p>
     <w:p>
@@ -300,7 +300,7 @@
       <w:r>
         <w:t>1.4. Культурные паттерны</w:t>
         <w:tab/>
-        <w:t>7</w:t>
+        <w:t>5</w:t>
       </w:r>
     </w:p>
     <w:p>
@@ -314,7 +314,7 @@
       <w:r>
         <w:t>1.5. Синхронный и диахронный подходы</w:t>
         <w:tab/>
-        <w:t>7</w:t>
+        <w:t>6</w:t>
       </w:r>
     </w:p>
     <w:p>
@@ -328,7 +328,7 @@
       <w:r>
         <w:t>1.6. Архаическая культура: оседлая и кочевая</w:t>
         <w:tab/>
-        <w:t>8</w:t>
+        <w:t>6</w:t>
       </w:r>
     </w:p>
     <w:p>
@@ -342,7 +342,21 @@
       <w:r>
         <w:t>1.7. Вариативность культурных форм</w:t>
         <w:tab/>
-        <w:t>9</w:t>
+        <w:t>7</w:t>
+      </w:r>
+    </w:p>
+    <w:p>
+      <w:pPr>
+        <w:tabs>
+          <w:tab w:pos="9354" w:val="right" w:leader="dot"/>
+        </w:tabs>
+        <w:spacing w:after="0" w:before="0" w:line="276" w:lineRule="auto"/>
+        <w:ind w:firstLine="0" w:left="425"/>
+      </w:pPr>
+      <w:r>
+        <w:t>Конспект лекции 1: Морфология культуры</w:t>
+        <w:tab/>
+        <w:t>7</w:t>
       </w:r>
     </w:p>
     <w:p>
@@ -356,7 +370,7 @@
       <w:r>
         <w:t>ГЛАВА 2. ЯЗЫК КУЛЬТУРЫ</w:t>
         <w:tab/>
-        <w:t>10</w:t>
+        <w:t>9</w:t>
       </w:r>
     </w:p>
     <w:p>
@@ -370,7 +384,7 @@
       <w:r>
         <w:t>2.1. Культура как мир знаков, значений и смыслов</w:t>
         <w:tab/>
-        <w:t>10</w:t>
+        <w:t>9</w:t>
       </w:r>
     </w:p>
     <w:p>
@@ -384,7 +398,7 @@
       <w:r>
         <w:t>2.2. Типология знаков</w:t>
         <w:tab/>
-        <w:t>10</w:t>
+        <w:t>9</w:t>
       </w:r>
     </w:p>
     <w:p>
@@ -398,7 +412,7 @@
       <w:r>
         <w:t>2.3. Естественный язык и мышление</w:t>
         <w:tab/>
-        <w:t>11</w:t>
+        <w:t>10</w:t>
       </w:r>
     </w:p>
     <w:p>
@@ -412,7 +426,7 @@
       <w:r>
         <w:t>2.4. Понятие «язык культуры»</w:t>
         <w:tab/>
-        <w:t>12</w:t>
+        <w:t>10</w:t>
       </w:r>
     </w:p>
     <w:p>
@@ -426,7 +440,21 @@
       <w:r>
         <w:t>2.5. Казахский язык как основа культурной идентичности</w:t>
         <w:tab/>
-        <w:t>13</w:t>
+        <w:t>11</w:t>
+      </w:r>
+    </w:p>
+    <w:p>
+      <w:pPr>
+        <w:tabs>
+          <w:tab w:pos="9354" w:val="right" w:leader="dot"/>
+        </w:tabs>
+        <w:spacing w:after="0" w:before="0" w:line="276" w:lineRule="auto"/>
+        <w:ind w:firstLine="0" w:left="425"/>
+      </w:pPr>
+      <w:r>
+        <w:t>Конспект лекции 2: Язык культуры</w:t>
+        <w:tab/>
+        <w:t>11</w:t>
       </w:r>
     </w:p>
     <w:p>
@@ -440,7 +468,7 @@
       <w:r>
         <w:t>ГЛАВА 3. СЕМИОТИКА КУЛЬТУРЫ</w:t>
         <w:tab/>
-        <w:t>14</w:t>
+        <w:t>13</w:t>
       </w:r>
     </w:p>
     <w:p>
@@ -454,7 +482,7 @@
       <w:r>
         <w:t>3.1. Культура как текст. Основоположники семиотики</w:t>
         <w:tab/>
-        <w:t>14</w:t>
+        <w:t>13</w:t>
       </w:r>
     </w:p>
     <w:p>
@@ -468,7 +496,7 @@
       <w:r>
         <w:t>3.2. Культурный код</w:t>
         <w:tab/>
-        <w:t>15</w:t>
+        <w:t>13</w:t>
       </w:r>
     </w:p>
     <w:p>
@@ -482,7 +510,7 @@
       <w:r>
         <w:t>3.3. Знак, символ и архетип</w:t>
         <w:tab/>
-        <w:t>15</w:t>
+        <w:t>14</w:t>
       </w:r>
     </w:p>
     <w:p>
@@ -496,7 +524,7 @@
       <w:r>
         <w:t>3.4. Символы Великой Степи</w:t>
         <w:tab/>
-        <w:t>16</w:t>
+        <w:t>14</w:t>
       </w:r>
     </w:p>
     <w:p>
@@ -510,7 +538,21 @@
       <w:r>
         <w:t>3.5. Символы в мифах, религиях, искусстве, политике и науке</w:t>
         <w:tab/>
-        <w:t>17</w:t>
+        <w:t>15</w:t>
+      </w:r>
+    </w:p>
+    <w:p>
+      <w:pPr>
+        <w:tabs>
+          <w:tab w:pos="9354" w:val="right" w:leader="dot"/>
+        </w:tabs>
+        <w:spacing w:after="0" w:before="0" w:line="276" w:lineRule="auto"/>
+        <w:ind w:firstLine="0" w:left="425"/>
+      </w:pPr>
+      <w:r>
+        <w:t>Конспект лекции 3: Семиотика культуры</w:t>
+        <w:tab/>
+        <w:t>16</w:t>
       </w:r>
     </w:p>
     <w:p>
@@ -524,7 +566,7 @@
       <w:r>
         <w:t>ГЛАВА 4. ОСНОВНЫЕ ФОРМЫ КУЛЬТУРЫ</w:t>
         <w:tab/>
-        <w:t>18</w:t>
+        <w:t>17</w:t>
       </w:r>
     </w:p>
     <w:p>
@@ -538,7 +580,7 @@
       <w:r>
         <w:t>4.1. Трёхмерная модель культуры и её фундамент</w:t>
         <w:tab/>
-        <w:t>18</w:t>
+        <w:t>17</w:t>
       </w:r>
     </w:p>
     <w:p>
@@ -552,7 +594,7 @@
       <w:r>
         <w:t>4.2. Миф</w:t>
         <w:tab/>
-        <w:t>18</w:t>
+        <w:t>17</w:t>
       </w:r>
     </w:p>
     <w:p>
@@ -566,7 +608,7 @@
       <w:r>
         <w:t>4.3. Религия</w:t>
         <w:tab/>
-        <w:t>19</w:t>
+        <w:t>17</w:t>
       </w:r>
     </w:p>
     <w:p>
@@ -580,7 +622,7 @@
       <w:r>
         <w:t>4.4. Искусство</w:t>
         <w:tab/>
-        <w:t>19</w:t>
+        <w:t>18</w:t>
       </w:r>
     </w:p>
     <w:p>
@@ -594,7 +636,7 @@
       <w:r>
         <w:t>4.5. Мораль, право и политика</w:t>
         <w:tab/>
-        <w:t>19</w:t>
+        <w:t>18</w:t>
       </w:r>
     </w:p>
     <w:p>
@@ -608,7 +650,7 @@
       <w:r>
         <w:t>4.6. Наука и техника</w:t>
         <w:tab/>
-        <w:t>20</w:t>
+        <w:t>18</w:t>
       </w:r>
     </w:p>
     <w:p>
@@ -622,7 +664,21 @@
       <w:r>
         <w:t>4.7. Культурные сценарии повседневной жизни</w:t>
         <w:tab/>
-        <w:t>21</w:t>
+        <w:t>19</w:t>
+      </w:r>
+    </w:p>
+    <w:p>
+      <w:pPr>
+        <w:tabs>
+          <w:tab w:pos="9354" w:val="right" w:leader="dot"/>
+        </w:tabs>
+        <w:spacing w:after="0" w:before="0" w:line="276" w:lineRule="auto"/>
+        <w:ind w:firstLine="0" w:left="425"/>
+      </w:pPr>
+      <w:r>
+        <w:t>Конспект лекции 4: Основные формы культуры</w:t>
+        <w:tab/>
+        <w:t>19</w:t>
       </w:r>
     </w:p>
     <w:p>
@@ -636,7 +692,7 @@
       <w:r>
         <w:t>ЗАКЛЮЧЕНИЕ</w:t>
         <w:tab/>
-        <w:t>22</w:t>
+        <w:t>21</w:t>
       </w:r>
     </w:p>
     <w:p>
@@ -1235,6 +1291,123 @@
       </w:r>
     </w:p>
     <w:p>
+      <w:pPr>
+        <w:spacing w:after="120" w:before="240"/>
+        <w:ind w:firstLine="709"/>
+        <w:jc w:val="both"/>
+      </w:pPr>
+      <w:r>
+        <w:rPr>
+          <w:b/>
+        </w:rPr>
+        <w:t>Конспект лекции 1: Морфология культуры</w:t>
+      </w:r>
+    </w:p>
+    <w:p>
+      <w:pPr>
+        <w:spacing w:after="0" w:before="0"/>
+        <w:ind w:firstLine="709"/>
+        <w:jc w:val="both"/>
+      </w:pPr>
+      <w:r>
+        <w:rPr>
+          <w:b w:val="0"/>
+        </w:rPr>
+        <w:t>– Морфология культуры — раздел культурологии, изучающий структуру, состав и формы культуры.</w:t>
+      </w:r>
+    </w:p>
+    <w:p>
+      <w:pPr>
+        <w:spacing w:after="0" w:before="0"/>
+        <w:ind w:firstLine="709"/>
+        <w:jc w:val="both"/>
+      </w:pPr>
+      <w:r>
+        <w:rPr>
+          <w:b w:val="0"/>
+        </w:rPr>
+        <w:t>– Пространство культуры: географическое, социальное, символическое, ментальное.</w:t>
+      </w:r>
+    </w:p>
+    <w:p>
+      <w:pPr>
+        <w:spacing w:after="0" w:before="0"/>
+        <w:ind w:firstLine="709"/>
+        <w:jc w:val="both"/>
+      </w:pPr>
+      <w:r>
+        <w:rPr>
+          <w:b w:val="0"/>
+        </w:rPr>
+        <w:t>– Время культуры: историческое, мифологическое, социальное; линейное (Запад) и циклическое (аграрные культуры).</w:t>
+      </w:r>
+    </w:p>
+    <w:p>
+      <w:pPr>
+        <w:spacing w:after="0" w:before="0"/>
+        <w:ind w:firstLine="709"/>
+        <w:jc w:val="both"/>
+      </w:pPr>
+      <w:r>
+        <w:rPr>
+          <w:b w:val="0"/>
+        </w:rPr>
+        <w:t>– Состав культуры: материальная (артефакты) и духовная (идеи, ценности, знания) культура.</w:t>
+      </w:r>
+    </w:p>
+    <w:p>
+      <w:pPr>
+        <w:spacing w:after="0" w:before="0"/>
+        <w:ind w:firstLine="709"/>
+        <w:jc w:val="both"/>
+      </w:pPr>
+      <w:r>
+        <w:rPr>
+          <w:b w:val="0"/>
+        </w:rPr>
+        <w:t>– Культурные паттерны: явные (ритуалы, обычаи, этикет) и скрытые (мышление, отношение ко времени и пространству).</w:t>
+      </w:r>
+    </w:p>
+    <w:p>
+      <w:pPr>
+        <w:spacing w:after="0" w:before="0"/>
+        <w:ind w:firstLine="709"/>
+        <w:jc w:val="both"/>
+      </w:pPr>
+      <w:r>
+        <w:rPr>
+          <w:b w:val="0"/>
+        </w:rPr>
+        <w:t>– Подходы: синхронный («фотография») и диахронный («фильм»); они дополняют друг друга.</w:t>
+      </w:r>
+    </w:p>
+    <w:p>
+      <w:pPr>
+        <w:spacing w:after="0" w:before="0"/>
+        <w:ind w:firstLine="709"/>
+        <w:jc w:val="both"/>
+      </w:pPr>
+      <w:r>
+        <w:rPr>
+          <w:b w:val="0"/>
+        </w:rPr>
+        <w:t>– Архаическая культура: коллективизм, миф, циклическое время, синкретизм, устная традиция. Оседлая и кочевая культуры различаются образом жизни, ценностями и социальной организацией.</w:t>
+      </w:r>
+    </w:p>
+    <w:p>
+      <w:pPr>
+        <w:spacing w:after="0" w:before="0"/>
+        <w:ind w:firstLine="709"/>
+        <w:jc w:val="both"/>
+      </w:pPr>
+      <w:r>
+        <w:rPr>
+          <w:b w:val="0"/>
+        </w:rPr>
+        <w:t>– Культурное разнообразие определяют география, история и социальная структура.</w:t>
+      </w:r>
+    </w:p>
+    <w:p>
       <w:r>
         <w:br w:type="page"/>
       </w:r>
@@ -1552,6 +1725,123 @@
       </w:r>
     </w:p>
     <w:p>
+      <w:pPr>
+        <w:spacing w:after="120" w:before="240"/>
+        <w:ind w:firstLine="709"/>
+        <w:jc w:val="both"/>
+      </w:pPr>
+      <w:r>
+        <w:rPr>
+          <w:b/>
+        </w:rPr>
+        <w:t>Конспект лекции 2: Язык культуры</w:t>
+      </w:r>
+    </w:p>
+    <w:p>
+      <w:pPr>
+        <w:spacing w:after="0" w:before="0"/>
+        <w:ind w:firstLine="709"/>
+        <w:jc w:val="both"/>
+      </w:pPr>
+      <w:r>
+        <w:rPr>
+          <w:b w:val="0"/>
+        </w:rPr>
+        <w:t>– Культура — семиотическая система: всё созданное человеком несёт знак и смысл.</w:t>
+      </w:r>
+    </w:p>
+    <w:p>
+      <w:pPr>
+        <w:spacing w:after="0" w:before="0"/>
+        <w:ind w:firstLine="709"/>
+        <w:jc w:val="both"/>
+      </w:pPr>
+      <w:r>
+        <w:rPr>
+          <w:b w:val="0"/>
+        </w:rPr>
+        <w:t>– Функции культуры как «памяти человечества»: хранение информации, передача опыта, генерирование смыслов.</w:t>
+      </w:r>
+    </w:p>
+    <w:p>
+      <w:pPr>
+        <w:spacing w:after="0" w:before="0"/>
+        <w:ind w:firstLine="709"/>
+        <w:jc w:val="both"/>
+      </w:pPr>
+      <w:r>
+        <w:rPr>
+          <w:b w:val="0"/>
+        </w:rPr>
+        <w:t>– Артефакт — «материализованный смысл»: утилитарный, символический, эстетический, этический аспекты.</w:t>
+      </w:r>
+    </w:p>
+    <w:p>
+      <w:pPr>
+        <w:spacing w:after="0" w:before="0"/>
+        <w:ind w:firstLine="709"/>
+        <w:jc w:val="both"/>
+      </w:pPr>
+      <w:r>
+        <w:rPr>
+          <w:b w:val="0"/>
+        </w:rPr>
+        <w:t>– Типы знаков: естественные, функциональные, иконические, символические (условные, по соглашению).</w:t>
+      </w:r>
+    </w:p>
+    <w:p>
+      <w:pPr>
+        <w:spacing w:after="0" w:before="0"/>
+        <w:ind w:firstLine="709"/>
+        <w:jc w:val="both"/>
+      </w:pPr>
+      <w:r>
+        <w:rPr>
+          <w:b w:val="0"/>
+        </w:rPr>
+        <w:t>– Естественный язык — главный код культуры: общение, хранение, мышление, познание.</w:t>
+      </w:r>
+    </w:p>
+    <w:p>
+      <w:pPr>
+        <w:spacing w:after="0" w:before="0"/>
+        <w:ind w:firstLine="709"/>
+        <w:jc w:val="both"/>
+      </w:pPr>
+      <w:r>
+        <w:rPr>
+          <w:b w:val="0"/>
+        </w:rPr>
+        <w:t>– Гипотеза Сепира–Уорфа: язык структурирует восприятие мира.</w:t>
+      </w:r>
+    </w:p>
+    <w:p>
+      <w:pPr>
+        <w:spacing w:after="0" w:before="0"/>
+        <w:ind w:firstLine="709"/>
+        <w:jc w:val="both"/>
+      </w:pPr>
+      <w:r>
+        <w:rPr>
+          <w:b w:val="0"/>
+        </w:rPr>
+        <w:t>– «Язык культуры» шире словесного: искусство, ритуалы, наука, мода, архитектура, цифровые коды.</w:t>
+      </w:r>
+    </w:p>
+    <w:p>
+      <w:pPr>
+        <w:spacing w:after="0" w:before="0"/>
+        <w:ind w:firstLine="709"/>
+        <w:jc w:val="both"/>
+      </w:pPr>
+      <w:r>
+        <w:rPr>
+          <w:b w:val="0"/>
+        </w:rPr>
+        <w:t>– Казахский язык — основа идентичности, носитель мировоззрения и исторической памяти; его функции — коммуникативная, когнитивная, аккумулятивная, эмотивная, идентификационная.</w:t>
+      </w:r>
+    </w:p>
+    <w:p>
       <w:r>
         <w:br w:type="page"/>
       </w:r>
@@ -1843,6 +2133,123 @@
       </w:r>
     </w:p>
     <w:p>
+      <w:pPr>
+        <w:spacing w:after="120" w:before="240"/>
+        <w:ind w:firstLine="709"/>
+        <w:jc w:val="both"/>
+      </w:pPr>
+      <w:r>
+        <w:rPr>
+          <w:b/>
+        </w:rPr>
+        <w:t>Конспект лекции 3: Семиотика культуры</w:t>
+      </w:r>
+    </w:p>
+    <w:p>
+      <w:pPr>
+        <w:spacing w:after="0" w:before="0"/>
+        <w:ind w:firstLine="709"/>
+        <w:jc w:val="both"/>
+      </w:pPr>
+      <w:r>
+        <w:rPr>
+          <w:b w:val="0"/>
+        </w:rPr>
+        <w:t>– Семиотика изучает культуру как текст; структурализм ищет скрытые правила культурных явлений.</w:t>
+      </w:r>
+    </w:p>
+    <w:p>
+      <w:pPr>
+        <w:spacing w:after="0" w:before="0"/>
+        <w:ind w:firstLine="709"/>
+        <w:jc w:val="both"/>
+      </w:pPr>
+      <w:r>
+        <w:rPr>
+          <w:b w:val="0"/>
+        </w:rPr>
+        <w:t>– Соссюр: знак = означающее + означаемое, связь произвольна. Кассирер: человек — «символическое животное».</w:t>
+      </w:r>
+    </w:p>
+    <w:p>
+      <w:pPr>
+        <w:spacing w:after="0" w:before="0"/>
+        <w:ind w:firstLine="709"/>
+        <w:jc w:val="both"/>
+      </w:pPr>
+      <w:r>
+        <w:rPr>
+          <w:b w:val="0"/>
+        </w:rPr>
+        <w:t>– Лотман: семиосфера; Барт: современные мифы; Кристева: интертекстуальность; Сулейменов: тюркские и славянские коды.</w:t>
+      </w:r>
+    </w:p>
+    <w:p>
+      <w:pPr>
+        <w:spacing w:after="0" w:before="0"/>
+        <w:ind w:firstLine="709"/>
+        <w:jc w:val="both"/>
+      </w:pPr>
+      <w:r>
+        <w:rPr>
+          <w:b w:val="0"/>
+        </w:rPr>
+        <w:t>– Культурный код — «прошивка» культуры, задаёт мышление, чувства и поведение; этос — моральный стержень.</w:t>
+      </w:r>
+    </w:p>
+    <w:p>
+      <w:pPr>
+        <w:spacing w:after="0" w:before="0"/>
+        <w:ind w:firstLine="709"/>
+        <w:jc w:val="both"/>
+      </w:pPr>
+      <w:r>
+        <w:rPr>
+          <w:b w:val="0"/>
+        </w:rPr>
+        <w:t>– Эволюция кодов: дописьменный, письменный, экранный, цифровой. Казахстанский код — наслоение традиционного, массового и современного.</w:t>
+      </w:r>
+    </w:p>
+    <w:p>
+      <w:pPr>
+        <w:spacing w:after="0" w:before="0"/>
+        <w:ind w:firstLine="709"/>
+        <w:jc w:val="both"/>
+      </w:pPr>
+      <w:r>
+        <w:rPr>
+          <w:b w:val="0"/>
+        </w:rPr>
+        <w:t>– Конвенциональный знак, символ и архетип (по Юнгу) различаются глубиной и универсальностью смысла.</w:t>
+      </w:r>
+    </w:p>
+    <w:p>
+      <w:pPr>
+        <w:spacing w:after="0" w:before="0"/>
+        <w:ind w:firstLine="709"/>
+        <w:jc w:val="both"/>
+      </w:pPr>
+      <w:r>
+        <w:rPr>
+          <w:b w:val="0"/>
+        </w:rPr>
+        <w:t>– Символы: звериный стиль саков, Тенгри, Көк Бөрі, тулпар, юрта, домбра; государственные символы Казахстана.</w:t>
+      </w:r>
+    </w:p>
+    <w:p>
+      <w:pPr>
+        <w:spacing w:after="0" w:before="0"/>
+        <w:ind w:firstLine="709"/>
+        <w:jc w:val="both"/>
+      </w:pPr>
+      <w:r>
+        <w:rPr>
+          <w:b w:val="0"/>
+        </w:rPr>
+        <w:t>– Символы религий, мифов, архитектуры, музыки и политики — универсальный язык человечества.</w:t>
+      </w:r>
+    </w:p>
+    <w:p>
       <w:r>
         <w:br w:type="page"/>
       </w:r>
@@ -2209,6 +2616,123 @@
           <w:b w:val="0"/>
         </w:rPr>
         <w:t>Сфера свободы и самовыражения включает игру, досуг и творчество. Игра — не только развлечение, но и способ обучения и социализации (спорт, театр). Культура досуга — способы проведения свободного времени: отдых, увлечения, творчество. Творчество позволяет человеку выразить себя через искусство и хобби. Таким образом, культура проявляется не только в «высоких» формах, но и в самых обычных повседневных действиях.</w:t>
+      </w:r>
+    </w:p>
+    <w:p>
+      <w:pPr>
+        <w:spacing w:after="120" w:before="240"/>
+        <w:ind w:firstLine="709"/>
+        <w:jc w:val="both"/>
+      </w:pPr>
+      <w:r>
+        <w:rPr>
+          <w:b/>
+        </w:rPr>
+        <w:t>Конспект лекции 4: Основные формы культуры</w:t>
+      </w:r>
+    </w:p>
+    <w:p>
+      <w:pPr>
+        <w:spacing w:after="0" w:before="0"/>
+        <w:ind w:firstLine="709"/>
+        <w:jc w:val="both"/>
+      </w:pPr>
+      <w:r>
+        <w:rPr>
+          <w:b w:val="0"/>
+        </w:rPr>
+        <w:t>– Трёхмерная модель культуры: горизонталь — разнообразие форм, вертикаль — иерархия ценностей, время — динамика развития.</w:t>
+      </w:r>
+    </w:p>
+    <w:p>
+      <w:pPr>
+        <w:spacing w:after="0" w:before="0"/>
+        <w:ind w:firstLine="709"/>
+        <w:jc w:val="both"/>
+      </w:pPr>
+      <w:r>
+        <w:rPr>
+          <w:b w:val="0"/>
+        </w:rPr>
+        <w:t>– Парадигмы, лики и сценарии культуры; фундамент — когнитивные, ценностные и регулятивные элементы.</w:t>
+      </w:r>
+    </w:p>
+    <w:p>
+      <w:pPr>
+        <w:spacing w:after="0" w:before="0"/>
+        <w:ind w:firstLine="709"/>
+        <w:jc w:val="both"/>
+      </w:pPr>
+      <w:r>
+        <w:rPr>
+          <w:b w:val="0"/>
+        </w:rPr>
+        <w:t>– Миф: сакральное повествование, объясняет мироустройство; функции — объяснение, регуляция, объединение.</w:t>
+      </w:r>
+    </w:p>
+    <w:p>
+      <w:pPr>
+        <w:spacing w:after="0" w:before="0"/>
+        <w:ind w:firstLine="709"/>
+        <w:jc w:val="both"/>
+      </w:pPr>
+      <w:r>
+        <w:rPr>
+          <w:b w:val="0"/>
+        </w:rPr>
+        <w:t>– Религия: вероучение, культ, организации; функции — мировоззренческая, утешительная, регулятивная.</w:t>
+      </w:r>
+    </w:p>
+    <w:p>
+      <w:pPr>
+        <w:spacing w:after="0" w:before="0"/>
+        <w:ind w:firstLine="709"/>
+        <w:jc w:val="both"/>
+      </w:pPr>
+      <w:r>
+        <w:rPr>
+          <w:b w:val="0"/>
+        </w:rPr>
+        <w:t>– Искусство: эстетическая, познавательная, воспитательная и гедонистическая функции.</w:t>
+      </w:r>
+    </w:p>
+    <w:p>
+      <w:pPr>
+        <w:spacing w:after="0" w:before="0"/>
+        <w:ind w:firstLine="709"/>
+        <w:jc w:val="both"/>
+      </w:pPr>
+      <w:r>
+        <w:rPr>
+          <w:b w:val="0"/>
+        </w:rPr>
+        <w:t>– Мораль (внешние нормы) и нравственность (внутренние убеждения); право — с внешним принуждением; политическая культура: патриархальная, подданническая, активистская.</w:t>
+      </w:r>
+    </w:p>
+    <w:p>
+      <w:pPr>
+        <w:spacing w:after="0" w:before="0"/>
+        <w:ind w:firstLine="709"/>
+        <w:jc w:val="both"/>
+      </w:pPr>
+      <w:r>
+        <w:rPr>
+          <w:b w:val="0"/>
+        </w:rPr>
+        <w:t>– Техника — «вторая природа» и знаковая система; наука стремится к истине, этический императив науки — ответственность учёного.</w:t>
+      </w:r>
+    </w:p>
+    <w:p>
+      <w:pPr>
+        <w:spacing w:after="0" w:before="0"/>
+        <w:ind w:firstLine="709"/>
+        <w:jc w:val="both"/>
+      </w:pPr>
+      <w:r>
+        <w:rPr>
+          <w:b w:val="0"/>
+        </w:rPr>
+        <w:t>– Культурные сценарии повседневной жизни: труд, учёба, игра, досуг, общение, творчество.</w:t>
       </w:r>
     </w:p>
     <w:p>

</xml_diff>